<commit_message>
Embed Application Architecture and Live Sync Loop design diagrams in Technical Design Document DOCX
</commit_message>
<xml_diff>
--- a/Technical_Design_Document.docx
+++ b/Technical_Design_Document.docx
@@ -236,6 +236,68 @@
     </w:p>
     <w:p>
       <w:pPr>
+        <w:spacing w:after="300" w:before="300"/>
+        <w:jc w:val="center"/>
+      </w:pPr>
+      <w:r>
+        <w:drawing>
+          <wp:inline distT="0" distB="0" distL="0" distR="0">
+            <wp:extent cx="4286250" cy="4286250"/>
+            <wp:effectExtent t="0" r="0" b="0" l="0"/>
+            <wp:docPr id="1" name="" descr="" title=""/>
+            <wp:cNvGraphicFramePr>
+              <a:graphicFrameLocks xmlns:a="http://schemas.openxmlformats.org/drawingml/2006/main" noChangeAspect="1"/>
+            </wp:cNvGraphicFramePr>
+            <a:graphic xmlns:a="http://schemas.openxmlformats.org/drawingml/2006/main">
+              <a:graphicData uri="http://schemas.openxmlformats.org/drawingml/2006/picture">
+                <pic:pic xmlns:pic="http://schemas.openxmlformats.org/drawingml/2006/picture">
+                  <pic:nvPicPr>
+                    <pic:cNvPr id="0" name="" descr=""/>
+                    <pic:cNvPicPr>
+                      <a:picLocks noChangeAspect="1" noChangeArrowheads="1"/>
+                    </pic:cNvPicPr>
+                  </pic:nvPicPr>
+                  <pic:blipFill>
+                    <a:blip r:embed="rId7" cstate="none"/>
+                    <a:srcRect/>
+                    <a:stretch>
+                      <a:fillRect/>
+                    </a:stretch>
+                  </pic:blipFill>
+                  <pic:spPr bwMode="auto">
+                    <a:xfrm>
+                      <a:off x="0" y="0"/>
+                      <a:ext cx="4286250" cy="4286250"/>
+                    </a:xfrm>
+                    <a:prstGeom prst="rect">
+                      <a:avLst/>
+                    </a:prstGeom>
+                  </pic:spPr>
+                </pic:pic>
+              </a:graphicData>
+            </a:graphic>
+          </wp:inline>
+        </w:drawing>
+      </w:r>
+    </w:p>
+    <w:p>
+      <w:pPr>
+        <w:spacing w:after="300"/>
+        <w:jc w:val="center"/>
+      </w:pPr>
+      <w:r>
+        <w:rPr>
+          <w:i/>
+          <w:iCs/>
+          <w:color w:val="6B7280"/>
+          <w:sz w:val="18"/>
+          <w:szCs w:val="18"/>
+        </w:rPr>
+        <w:t xml:space="preserve">Figure 1: StudyTest AI - Application Architecture Flow Diagram</w:t>
+      </w:r>
+    </w:p>
+    <w:p>
+      <w:pPr>
         <w:pStyle w:val="Heading1"/>
         <w:spacing w:after="200" w:before="600"/>
       </w:pPr>
@@ -394,6 +456,68 @@
           <w:szCs w:val="24"/>
         </w:rPr>
         <w:t xml:space="preserve">During the LOBBY phase, hosts customize titles, bullet outlines, and poll choice selections. Saving deletes old slides and inserts the new list transactional array using nested relational mappings. Sync clients poll at 1.5s intervals to update views.</w:t>
+      </w:r>
+    </w:p>
+    <w:p>
+      <w:pPr>
+        <w:spacing w:after="300" w:before="300"/>
+        <w:jc w:val="center"/>
+      </w:pPr>
+      <w:r>
+        <w:drawing>
+          <wp:inline distT="0" distB="0" distL="0" distR="0">
+            <wp:extent cx="4286250" cy="4286250"/>
+            <wp:effectExtent t="0" r="0" b="0" l="0"/>
+            <wp:docPr id="1" name="" descr="" title=""/>
+            <wp:cNvGraphicFramePr>
+              <a:graphicFrameLocks xmlns:a="http://schemas.openxmlformats.org/drawingml/2006/main" noChangeAspect="1"/>
+            </wp:cNvGraphicFramePr>
+            <a:graphic xmlns:a="http://schemas.openxmlformats.org/drawingml/2006/main">
+              <a:graphicData uri="http://schemas.openxmlformats.org/drawingml/2006/picture">
+                <pic:pic xmlns:pic="http://schemas.openxmlformats.org/drawingml/2006/picture">
+                  <pic:nvPicPr>
+                    <pic:cNvPr id="0" name="" descr=""/>
+                    <pic:cNvPicPr>
+                      <a:picLocks noChangeAspect="1" noChangeArrowheads="1"/>
+                    </pic:cNvPicPr>
+                  </pic:nvPicPr>
+                  <pic:blipFill>
+                    <a:blip r:embed="rId8" cstate="none"/>
+                    <a:srcRect/>
+                    <a:stretch>
+                      <a:fillRect/>
+                    </a:stretch>
+                  </pic:blipFill>
+                  <pic:spPr bwMode="auto">
+                    <a:xfrm>
+                      <a:off x="0" y="0"/>
+                      <a:ext cx="4286250" cy="4286250"/>
+                    </a:xfrm>
+                    <a:prstGeom prst="rect">
+                      <a:avLst/>
+                    </a:prstGeom>
+                  </pic:spPr>
+                </pic:pic>
+              </a:graphicData>
+            </a:graphic>
+          </wp:inline>
+        </w:drawing>
+      </w:r>
+    </w:p>
+    <w:p>
+      <w:pPr>
+        <w:spacing w:after="300"/>
+        <w:jc w:val="center"/>
+      </w:pPr>
+      <w:r>
+        <w:rPr>
+          <w:i/>
+          <w:iCs/>
+          <w:color w:val="6B7280"/>
+          <w:sz w:val="18"/>
+          <w:szCs w:val="18"/>
+        </w:rPr>
+        <w:t xml:space="preserve">Figure 2: Interactive Live Session Real-time Synchronization Loop</w:t>
       </w:r>
     </w:p>
     <w:p>

</xml_diff>

<commit_message>
Enhance Technical Design Document: add all requested chapters and structure Table of Contents
</commit_message>
<xml_diff>
--- a/Technical_Design_Document.docx
+++ b/Technical_Design_Document.docx
@@ -28,10 +28,10 @@
           <w:b/>
           <w:bCs/>
           <w:color w:val="4B5563"/>
-          <w:sz w:val="32"/>
-          <w:szCs w:val="32"/>
-        </w:rPr>
-        <w:t xml:space="preserve">TECHNICAL DESIGN DOCUMENT</w:t>
+          <w:sz w:val="28"/>
+          <w:szCs w:val="28"/>
+        </w:rPr>
+        <w:t xml:space="preserve">COMPREHENSIVE TECHNICAL DESIGN DOCUMENT</w:t>
       </w:r>
     </w:p>
     <w:p>
@@ -47,12 +47,12 @@
           <w:sz w:val="20"/>
           <w:szCs w:val="20"/>
         </w:rPr>
-        <w:t xml:space="preserve">AI-Powered Learning Platform &amp; Real-Time Classroom Presentation Engine</w:t>
-      </w:r>
-    </w:p>
-    <w:p>
-      <w:pPr>
-        <w:spacing w:before="2400"/>
+        <w:t xml:space="preserve">An AI-Powered Learning Platform and Interactive Presentation Engine</w:t>
+      </w:r>
+    </w:p>
+    <w:p>
+      <w:pPr>
+        <w:spacing w:before="2000"/>
         <w:jc w:val="left"/>
       </w:pPr>
       <w:r>
@@ -69,24 +69,24 @@
           <w:sz w:val="24"/>
           <w:szCs w:val="24"/>
         </w:rPr>
-        <w:t xml:space="preserve">StudyTest AI Development Team
-</w:t>
-      </w:r>
-      <w:r>
-        <w:rPr>
-          <w:b/>
-          <w:bCs/>
-          <w:sz w:val="24"/>
-          <w:szCs w:val="24"/>
-        </w:rPr>
-        <w:t xml:space="preserve">OS Target: </w:t>
-      </w:r>
-      <w:r>
-        <w:rPr>
-          <w:sz w:val="24"/>
-          <w:szCs w:val="24"/>
-        </w:rPr>
-        <w:t xml:space="preserve">macOS Target Compilation
+        <w:t xml:space="preserve">StudyTest AI Architecture Team
+</w:t>
+      </w:r>
+      <w:r>
+        <w:rPr>
+          <w:b/>
+          <w:bCs/>
+          <w:sz w:val="24"/>
+          <w:szCs w:val="24"/>
+        </w:rPr>
+        <w:t xml:space="preserve">OS Platform: </w:t>
+      </w:r>
+      <w:r>
+        <w:rPr>
+          <w:sz w:val="24"/>
+          <w:szCs w:val="24"/>
+        </w:rPr>
+        <w:t xml:space="preserve">macOS Core Target
 </w:t>
       </w:r>
       <w:r>
@@ -103,7 +103,7 @@
           <w:sz w:val="24"/>
           <w:szCs w:val="24"/>
         </w:rPr>
-        <w:t xml:space="preserve">1.4.0 (Stable Release)
+        <w:t xml:space="preserve">1.5.0 (Enterprise Specification)
 </w:t>
       </w:r>
       <w:r>
@@ -135,19 +135,132 @@
         <w:spacing w:after="200" w:before="600"/>
       </w:pPr>
       <w:r>
-        <w:t xml:space="preserve">1. Executive Summary</w:t>
-      </w:r>
-    </w:p>
-    <w:p>
-      <w:pPr>
-        <w:spacing w:after="200"/>
-      </w:pPr>
-      <w:r>
-        <w:rPr>
-          <w:sz w:val="24"/>
-          <w:szCs w:val="24"/>
-        </w:rPr>
-        <w:t xml:space="preserve">StudyTest AI is a premium, state-of-the-art educational tech platform designed to simplify material assimilation through artificial intelligence. By uploading study documents (PDFs), students can generate personalized mock quizzes, create customizable flashcard decks, chat with an interactive tutor, and schedule smart study plans. For teachers and educators, the platform provides a complete real-time classroom presentation engine (matching Mentimeter core features) to host live slide shows, multiple choice quizzes, keyword word clouds, surveys, and upvoteable audience Q&amp;A sessions.</w:t>
+        <w:t xml:space="preserve">Table of Contents</w:t>
+      </w:r>
+    </w:p>
+    <w:p>
+      <w:pPr>
+        <w:spacing w:after="100"/>
+      </w:pPr>
+      <w:r>
+        <w:rPr>
+          <w:b/>
+          <w:bCs/>
+          <w:sz w:val="24"/>
+          <w:szCs w:val="24"/>
+        </w:rPr>
+        <w:t xml:space="preserve">1. Executive Summary
+</w:t>
+      </w:r>
+      <w:r>
+        <w:rPr>
+          <w:b/>
+          <w:bCs/>
+          <w:sz w:val="24"/>
+          <w:szCs w:val="24"/>
+        </w:rPr>
+        <w:t xml:space="preserve">2. Background &amp; Problem Statement
+</w:t>
+      </w:r>
+      <w:r>
+        <w:rPr>
+          <w:b/>
+          <w:bCs/>
+          <w:sz w:val="24"/>
+          <w:szCs w:val="24"/>
+        </w:rPr>
+        <w:t xml:space="preserve">3. Goals &amp; Non-Goals
+</w:t>
+      </w:r>
+      <w:r>
+        <w:rPr>
+          <w:b/>
+          <w:bCs/>
+          <w:sz w:val="24"/>
+          <w:szCs w:val="24"/>
+        </w:rPr>
+        <w:t xml:space="preserve">4. User Stories
+</w:t>
+      </w:r>
+      <w:r>
+        <w:rPr>
+          <w:b/>
+          <w:bCs/>
+          <w:sz w:val="24"/>
+          <w:szCs w:val="24"/>
+        </w:rPr>
+        <w:t xml:space="preserve">5. Functional &amp; Non-Functional Requirements
+</w:t>
+      </w:r>
+      <w:r>
+        <w:rPr>
+          <w:b/>
+          <w:bCs/>
+          <w:sz w:val="24"/>
+          <w:szCs w:val="24"/>
+        </w:rPr>
+        <w:t xml:space="preserve">6. High-Level Architecture &amp; Tech Stack
+</w:t>
+      </w:r>
+      <w:r>
+        <w:rPr>
+          <w:b/>
+          <w:bCs/>
+          <w:sz w:val="24"/>
+          <w:szCs w:val="24"/>
+        </w:rPr>
+        <w:t xml:space="preserve">7. System Components &amp; Interface Design
+</w:t>
+      </w:r>
+      <w:r>
+        <w:rPr>
+          <w:b/>
+          <w:bCs/>
+          <w:sz w:val="24"/>
+          <w:szCs w:val="24"/>
+        </w:rPr>
+        <w:t xml:space="preserve">8. AI Pipeline &amp; Gateway Routing
+</w:t>
+      </w:r>
+      <w:r>
+        <w:rPr>
+          <w:b/>
+          <w:bCs/>
+          <w:sz w:val="24"/>
+          <w:szCs w:val="24"/>
+        </w:rPr>
+        <w:t xml:space="preserve">9. API Design &amp; Security Configurations
+</w:t>
+      </w:r>
+      <w:r>
+        <w:rPr>
+          <w:b/>
+          <w:bCs/>
+          <w:sz w:val="24"/>
+          <w:szCs w:val="24"/>
+        </w:rPr>
+        <w:t xml:space="preserve">10. Performance, Scale &amp; Logging
+</w:t>
+      </w:r>
+      <w:r>
+        <w:rPr>
+          <w:b/>
+          <w:bCs/>
+          <w:sz w:val="24"/>
+          <w:szCs w:val="24"/>
+        </w:rPr>
+        <w:t xml:space="preserve">11. Testing Strategy &amp; Design Decisions
+</w:t>
+      </w:r>
+      <w:r>
+        <w:rPr>
+          <w:b/>
+          <w:bCs/>
+          <w:sz w:val="24"/>
+          <w:szCs w:val="24"/>
+        </w:rPr>
+        <w:t xml:space="preserve">12. Future Enhancements &amp; Appendix
+</w:t>
       </w:r>
     </w:p>
     <w:p>
@@ -156,7 +269,7 @@
         <w:spacing w:after="200" w:before="600"/>
       </w:pPr>
       <w:r>
-        <w:t xml:space="preserve">2. System Architecture Design</w:t>
+        <w:t xml:space="preserve">1. Executive Summary</w:t>
       </w:r>
     </w:p>
     <w:p>
@@ -168,7 +281,37 @@
           <w:sz w:val="24"/>
           <w:szCs w:val="24"/>
         </w:rPr>
-        <w:t xml:space="preserve">The application is built on top of the modern Next.js framework (utilizing App Router structure) for optimized routing, server actions execution, and static page optimizations. Below are the key architectural layers:</w:t>
+        <w:t xml:space="preserve">StudyTest AI is a premium educational technology platform designed to streamline material assimilation through automated artificial intelligence pipelines. The platform targets two user personas: Students (who need contextual tutoring, mock quiz attempts, smart study planning calendar tools, and gamified flashcards) and Presenters/Teachers (who host live interactive sessions containing bullet point outlines, multiple choice quiz tournaments, real-time polls, tag cloud visualizers, and audience Q&amp;A boards).</w:t>
+      </w:r>
+    </w:p>
+    <w:p>
+      <w:pPr>
+        <w:pStyle w:val="Heading1"/>
+        <w:spacing w:after="200" w:before="600"/>
+      </w:pPr>
+      <w:r>
+        <w:t xml:space="preserve">2. Background &amp; Problem Statement</w:t>
+      </w:r>
+    </w:p>
+    <w:p>
+      <w:pPr>
+        <w:spacing w:after="200"/>
+      </w:pPr>
+      <w:r>
+        <w:rPr>
+          <w:sz w:val="24"/>
+          <w:szCs w:val="24"/>
+        </w:rPr>
+        <w:t xml:space="preserve">Traditional learning methodologies fail to keep students engaged during remote self-study and classroom instruction. Study materials (such as long PDFs and textbook chapters) are dry and hard to structure, while interactive classroom tools (like Mentimeter) are disconnected from self-study outlines. StudyTest AI bridges this gap by merging a document processing AI engine with an E2E real-time multiplayer slide deck engine so that study resources feed directly into quiz game rooms and live sessions.</w:t>
+      </w:r>
+    </w:p>
+    <w:p>
+      <w:pPr>
+        <w:pStyle w:val="Heading1"/>
+        <w:spacing w:after="200" w:before="600"/>
+      </w:pPr>
+      <w:r>
+        <w:t xml:space="preserve">3. Goals &amp; Non-Goals</w:t>
       </w:r>
     </w:p>
     <w:p>
@@ -182,14 +325,72 @@
           <w:sz w:val="24"/>
           <w:szCs w:val="24"/>
         </w:rPr>
-        <w:t xml:space="preserve">• Client Component Layer: </w:t>
-      </w:r>
-      <w:r>
-        <w:rPr>
-          <w:sz w:val="24"/>
-          <w:szCs w:val="24"/>
-        </w:rPr>
-        <w:t xml:space="preserve">Built with React client views, Lucide icons, and Vanilla/Tailwind CSS variables for a premium dark mode aesthetic. Handles real-time polling sync loops (1.5-second intervals) for interactive slideshow synchronization.</w:t>
+        <w:t xml:space="preserve">3.1 Project Goals
+</w:t>
+      </w:r>
+      <w:r>
+        <w:rPr>
+          <w:sz w:val="24"/>
+          <w:szCs w:val="24"/>
+        </w:rPr>
+        <w:t xml:space="preserve">• Standardize Visual PDF Parsing: Support parsing multi-page documents and converting pages to base64 images for OCR extraction.
+</w:t>
+      </w:r>
+      <w:r>
+        <w:rPr>
+          <w:sz w:val="24"/>
+          <w:szCs w:val="24"/>
+        </w:rPr>
+        <w:t xml:space="preserve">• Unified AI Gateways: Allow users to securely provide their own keys (BYOK model) dynamically saved in browser cookie variables.
+</w:t>
+      </w:r>
+      <w:r>
+        <w:rPr>
+          <w:sz w:val="24"/>
+          <w:szCs w:val="24"/>
+        </w:rPr>
+        <w:t xml:space="preserve">• Live Interactive Deck: Sync presenters with student devices over rapid polling loops with distinct poll, quiz, Q&amp;A, and leaderboard states.
+</w:t>
+      </w:r>
+    </w:p>
+    <w:p>
+      <w:pPr>
+        <w:spacing w:after="200"/>
+      </w:pPr>
+      <w:r>
+        <w:rPr>
+          <w:b/>
+          <w:bCs/>
+          <w:sz w:val="24"/>
+          <w:szCs w:val="24"/>
+        </w:rPr>
+        <w:t xml:space="preserve">3.2 Non-Goals
+</w:t>
+      </w:r>
+      <w:r>
+        <w:rPr>
+          <w:sz w:val="24"/>
+          <w:szCs w:val="24"/>
+        </w:rPr>
+        <w:t xml:space="preserve">• Built-in Video Conferencing: Hosting audio/video streams is out of scope; the presentation engine assumes screen sharing or physical classrooms.
+</w:t>
+      </w:r>
+      <w:r>
+        <w:rPr>
+          <w:sz w:val="24"/>
+          <w:szCs w:val="24"/>
+        </w:rPr>
+        <w:t xml:space="preserve">• Permanent File Hosting: The system acts as a processor; heavy file storage hosting remains out of bounds.
+</w:t>
+      </w:r>
+    </w:p>
+    <w:p>
+      <w:pPr>
+        <w:pStyle w:val="Heading1"/>
+        <w:spacing w:after="200" w:before="600"/>
+      </w:pPr>
+      <w:r>
+        <w:t xml:space="preserve">4. User Stories</w:t>
       </w:r>
     </w:p>
     <w:p>
@@ -203,14 +404,35 @@
           <w:sz w:val="24"/>
           <w:szCs w:val="24"/>
         </w:rPr>
-        <w:t xml:space="preserve">• Server Actions Controllers: </w:t>
-      </w:r>
-      <w:r>
-        <w:rPr>
-          <w:sz w:val="24"/>
-          <w:szCs w:val="24"/>
-        </w:rPr>
-        <w:t xml:space="preserve">Next.js server-side modules that execute secure transactional commands (document uploading, live slide updates, quiz creations) directly interfacing with the Prisma client.</w:t>
+        <w:t xml:space="preserve">• As an Educator, </w:t>
+      </w:r>
+      <w:r>
+        <w:rPr>
+          <w:sz w:val="24"/>
+          <w:szCs w:val="24"/>
+        </w:rPr>
+        <w:t xml:space="preserve">I want to create customized slide decks with information bullets, MCQ quizzes, and survey polls so that I can gauge class comprehension in real time.</w:t>
+      </w:r>
+    </w:p>
+    <w:p>
+      <w:pPr>
+        <w:spacing w:after="150"/>
+      </w:pPr>
+      <w:r>
+        <w:rPr>
+          <w:b/>
+          <w:bCs/>
+          <w:sz w:val="24"/>
+          <w:szCs w:val="24"/>
+        </w:rPr>
+        <w:t xml:space="preserve">• As a Student, </w:t>
+      </w:r>
+      <w:r>
+        <w:rPr>
+          <w:sz w:val="24"/>
+          <w:szCs w:val="24"/>
+        </w:rPr>
+        <w:t xml:space="preserve">I want to join multiplayer quiz lobbies via sharing codes, submit answers, and see my rank on leaderboards to stay motivated.</w:t>
       </w:r>
     </w:p>
     <w:p>
@@ -224,14 +446,93 @@
           <w:sz w:val="24"/>
           <w:szCs w:val="24"/>
         </w:rPr>
-        <w:t xml:space="preserve">• Database ORM Layer: </w:t>
-      </w:r>
-      <w:r>
-        <w:rPr>
-          <w:sz w:val="24"/>
-          <w:szCs w:val="24"/>
-        </w:rPr>
-        <w:t xml:space="preserve">Prisma client connecting to a Neon PostgreSQL instance. Enables transactional queries, cascade deletions, and relational syncs.</w:t>
+        <w:t xml:space="preserve">• As a Student, </w:t>
+      </w:r>
+      <w:r>
+        <w:rPr>
+          <w:sz w:val="24"/>
+          <w:szCs w:val="24"/>
+        </w:rPr>
+        <w:t xml:space="preserve">I want to upload a PDF textbook outline, auto-generate flashcards, and study them with gamified score systems.</w:t>
+      </w:r>
+    </w:p>
+    <w:p>
+      <w:pPr>
+        <w:pStyle w:val="Heading1"/>
+        <w:spacing w:after="200" w:before="600"/>
+      </w:pPr>
+      <w:r>
+        <w:t xml:space="preserve">5. Functional &amp; Non-Functional Requirements</w:t>
+      </w:r>
+    </w:p>
+    <w:p>
+      <w:pPr>
+        <w:spacing w:after="150"/>
+      </w:pPr>
+      <w:r>
+        <w:rPr>
+          <w:b/>
+          <w:bCs/>
+          <w:sz w:val="24"/>
+          <w:szCs w:val="24"/>
+        </w:rPr>
+        <w:t xml:space="preserve">5.1 Functional Requirements
+</w:t>
+      </w:r>
+      <w:r>
+        <w:rPr>
+          <w:sz w:val="24"/>
+          <w:szCs w:val="24"/>
+        </w:rPr>
+        <w:t xml:space="preserve">• Render dynamic presentations with instant slide customizations (add, delete, reorder slides).
+• Handle distinct POLL and MULTIPLE_CHOICE slide structures (polls display live votes without score calculations; quiz slides award 100 points for correct submissions).
+• Support audience Q&amp;A submission boards with presenter-approved moderations and upvotes.
+</w:t>
+      </w:r>
+    </w:p>
+    <w:p>
+      <w:pPr>
+        <w:spacing w:after="200"/>
+      </w:pPr>
+      <w:r>
+        <w:rPr>
+          <w:b/>
+          <w:bCs/>
+          <w:sz w:val="24"/>
+          <w:szCs w:val="24"/>
+        </w:rPr>
+        <w:t xml:space="preserve">5.2 Non-Functional Requirements
+</w:t>
+      </w:r>
+      <w:r>
+        <w:rPr>
+          <w:sz w:val="24"/>
+          <w:szCs w:val="24"/>
+        </w:rPr>
+        <w:t xml:space="preserve">• Synchronization Latency: Interactive slide state updates must propagate to student clients within a target threshold of 1.5 seconds.
+• High-Contrast Premium Theme: Responsive visual interfaces optimized for mobile and desktop viewports utilizing sleek dark themes.
+</w:t>
+      </w:r>
+    </w:p>
+    <w:p>
+      <w:pPr>
+        <w:pStyle w:val="Heading1"/>
+        <w:spacing w:after="200" w:before="600"/>
+      </w:pPr>
+      <w:r>
+        <w:t xml:space="preserve">6. High-Level Architecture &amp; Tech Stack</w:t>
+      </w:r>
+    </w:p>
+    <w:p>
+      <w:pPr>
+        <w:spacing w:after="200"/>
+      </w:pPr>
+      <w:r>
+        <w:rPr>
+          <w:sz w:val="24"/>
+          <w:szCs w:val="24"/>
+        </w:rPr>
+        <w:t xml:space="preserve">StudyTest AI is architected as a Next.js web application utilizing Neon serverless PostgreSQL storage, Auth.js for session validation, and Prisma ORM client mappings.</w:t>
       </w:r>
     </w:p>
     <w:p>
@@ -302,7 +603,54 @@
         <w:spacing w:after="200" w:before="600"/>
       </w:pPr>
       <w:r>
-        <w:t xml:space="preserve">3. Database Schema Architecture</w:t>
+        <w:t xml:space="preserve">7. System Components &amp; Interface Design</w:t>
+      </w:r>
+    </w:p>
+    <w:p>
+      <w:pPr>
+        <w:spacing w:after="150"/>
+      </w:pPr>
+      <w:r>
+        <w:rPr>
+          <w:b/>
+          <w:bCs/>
+          <w:sz w:val="24"/>
+          <w:szCs w:val="24"/>
+        </w:rPr>
+        <w:t xml:space="preserve">7.1 Frontend Component Design
+</w:t>
+      </w:r>
+      <w:r>
+        <w:rPr>
+          <w:sz w:val="24"/>
+          <w:szCs w:val="24"/>
+        </w:rPr>
+        <w:t xml:space="preserve">• Presenter Client: Controls Lobby status, slide transitions, results displays, and customizer slide lists.
+• Student Client: Polling loop updates slide views dynamically, displaying voting cards and input fields.
+</w:t>
+      </w:r>
+    </w:p>
+    <w:p>
+      <w:pPr>
+        <w:spacing w:after="150"/>
+      </w:pPr>
+      <w:r>
+        <w:rPr>
+          <w:b/>
+          <w:bCs/>
+          <w:sz w:val="24"/>
+          <w:szCs w:val="24"/>
+        </w:rPr>
+        <w:t xml:space="preserve">7.2 Backend Component Design
+</w:t>
+      </w:r>
+      <w:r>
+        <w:rPr>
+          <w:sz w:val="24"/>
+          <w:szCs w:val="24"/>
+        </w:rPr>
+        <w:t xml:space="preserve">• Server Actions Controllers: Transactional routes executing state logic (join lobbies, submit answers, advanced slides).
+</w:t>
       </w:r>
     </w:p>
     <w:p>
@@ -311,76 +659,23 @@
       </w:pPr>
       <w:r>
         <w:rPr>
-          <w:sz w:val="24"/>
-          <w:szCs w:val="24"/>
-        </w:rPr>
-        <w:t xml:space="preserve">The database models are structured to scale and support multiplayer sessions. The main relations are described below:</w:t>
-      </w:r>
-    </w:p>
-    <w:p>
-      <w:pPr>
-        <w:spacing w:after="150"/>
-      </w:pPr>
-      <w:r>
-        <w:rPr>
-          <w:b/>
-          <w:bCs/>
-          <w:sz w:val="24"/>
-          <w:szCs w:val="24"/>
-        </w:rPr>
-        <w:t xml:space="preserve">3.1 User &amp; Documents relations
-</w:t>
-      </w:r>
-      <w:r>
-        <w:rPr>
-          <w:sz w:val="24"/>
-          <w:szCs w:val="24"/>
-        </w:rPr>
-        <w:t xml:space="preserve">Users upload documents. Each document records metadata (file size, page count, filename), along with parsed textual representations ('extractedText') and visual summaries ('visualOutline'). Deleting a user cascades and deletes all related documents.</w:t>
-      </w:r>
-    </w:p>
-    <w:p>
-      <w:pPr>
-        <w:spacing w:after="150"/>
-      </w:pPr>
-      <w:r>
-        <w:rPr>
-          <w:b/>
-          <w:bCs/>
-          <w:sz w:val="24"/>
-          <w:szCs w:val="24"/>
-        </w:rPr>
-        <w:t xml:space="preserve">3.2 Quiz &amp; Flashcard models
-</w:t>
-      </w:r>
-      <w:r>
-        <w:rPr>
-          <w:sz w:val="24"/>
-          <w:szCs w:val="24"/>
-        </w:rPr>
-        <w:t xml:space="preserve">Quiz sessions record options, correct answers, and grading thresholds. Flashcard decks map card terms and definitions generated via visual model extraction.</w:t>
-      </w:r>
-    </w:p>
-    <w:p>
-      <w:pPr>
-        <w:spacing w:after="200"/>
-      </w:pPr>
-      <w:r>
-        <w:rPr>
-          <w:b/>
-          <w:bCs/>
-          <w:sz w:val="24"/>
-          <w:szCs w:val="24"/>
-        </w:rPr>
-        <w:t xml:space="preserve">3.3 Interactive Live Session tables
-</w:t>
-      </w:r>
-      <w:r>
-        <w:rPr>
-          <w:sz w:val="24"/>
-          <w:szCs w:val="24"/>
-        </w:rPr>
-        <w:t xml:space="preserve">Interactive Sessions ('interactive_sessions') map to a document. Slides ('session_slides') record index positions, type ('INFO', 'MULTIPLE_CHOICE', 'POLL', 'WORD_CLOUD', 'LEADERBOARD', 'Q_A'), and choices. Student participants register, submit slide responses, and post upvoteable Q&amp;As.</w:t>
+          <w:b/>
+          <w:bCs/>
+          <w:sz w:val="24"/>
+          <w:szCs w:val="24"/>
+        </w:rPr>
+        <w:t xml:space="preserve">7.3 Database schema design
+</w:t>
+      </w:r>
+      <w:r>
+        <w:rPr>
+          <w:sz w:val="24"/>
+          <w:szCs w:val="24"/>
+        </w:rPr>
+        <w:t xml:space="preserve">• InteractiveSession: maps session lobby settings.
+• SessionSlide: tracks indices, types, options, and correct answers.
+• SessionParticipant &amp; SessionResponse: tracks connected sockets/profiles, scores, and votes.
+</w:t>
       </w:r>
     </w:p>
     <w:p>
@@ -389,7 +684,28 @@
         <w:spacing w:after="200" w:before="600"/>
       </w:pPr>
       <w:r>
-        <w:t xml:space="preserve">4. Core Service Layers &amp; AI Proxy</w:t>
+        <w:t xml:space="preserve">8. AI Pipeline &amp; Gateway Routing</w:t>
+      </w:r>
+    </w:p>
+    <w:p>
+      <w:pPr>
+        <w:spacing w:after="200"/>
+      </w:pPr>
+      <w:r>
+        <w:rPr>
+          <w:sz w:val="24"/>
+          <w:szCs w:val="24"/>
+        </w:rPr>
+        <w:t xml:space="preserve">The AI router utilizes request-level configuration. Settings (keys, providers, model names) are read from cookies, ensuring zero database key persistence. PDF processing executes visual outlines via multimodal AI prompts by passing base64 documents inside a standard data-url. Fallback options generate static layouts if APIs fail.</w:t>
+      </w:r>
+    </w:p>
+    <w:p>
+      <w:pPr>
+        <w:pStyle w:val="Heading1"/>
+        <w:spacing w:after="200" w:before="600"/>
+      </w:pPr>
+      <w:r>
+        <w:t xml:space="preserve">9. API Design &amp; Security Configurations</w:t>
       </w:r>
     </w:p>
     <w:p>
@@ -403,15 +719,17 @@
           <w:sz w:val="24"/>
           <w:szCs w:val="24"/>
         </w:rPr>
-        <w:t xml:space="preserve">4.1 Dynamic Cookie-Driven AI Router
-</w:t>
-      </w:r>
-      <w:r>
-        <w:rPr>
-          <w:sz w:val="24"/>
-          <w:szCs w:val="24"/>
-        </w:rPr>
-        <w:t xml:space="preserve">The platform features a 'Bring Your Own Keys' (BYOK) paradigm. The global AI client in 'ai.service.ts' acts as an asynchronous proxy wrapper. It parses settings (API key, model choice, provider choice) dynamically from browser cookies at request time, routing completions to OpenAI, OpenRouter, Groq, or default system Gemini keys securely.</w:t>
+        <w:t xml:space="preserve">9.1 API Server Actions Interfaces
+</w:t>
+      </w:r>
+      <w:r>
+        <w:rPr>
+          <w:sz w:val="24"/>
+          <w:szCs w:val="24"/>
+        </w:rPr>
+        <w:t xml:space="preserve">• submitSlideResponseAction(slideId, value, participantUserId): Records poll selections or quiz grades.
+• updateSessionSlidesAction(sessionId, slides): Recreates slide array lists inside a transaction.
+</w:t>
       </w:r>
     </w:p>
     <w:p>
@@ -425,15 +743,15 @@
           <w:sz w:val="24"/>
           <w:szCs w:val="24"/>
         </w:rPr>
-        <w:t xml:space="preserve">4.2 PDF OCR Engine
-</w:t>
-      </w:r>
-      <w:r>
-        <w:rPr>
-          <w:sz w:val="24"/>
-          <w:szCs w:val="24"/>
-        </w:rPr>
-        <w:t xml:space="preserve">Utilizes standardized OpenAI-compatible multimodal gateways to pass base64-encoded PDF visual payloads directly in a single data URL call structure: 'data:application/pdf;base64,...' to extract clean structures, outline layouts, and study definitions.</w:t>
+        <w:t xml:space="preserve">9.2 Error Handling &amp; Resilience
+</w:t>
+      </w:r>
+      <w:r>
+        <w:rPr>
+          <w:sz w:val="24"/>
+          <w:szCs w:val="24"/>
+        </w:rPr>
+        <w:t xml:space="preserve">If an LLM OCR parser request times out, the backend defaults to standard dynamic text outlines automatically to protect user workflow continuity.</w:t>
       </w:r>
     </w:p>
     <w:p>
@@ -447,15 +765,70 @@
           <w:sz w:val="24"/>
           <w:szCs w:val="24"/>
         </w:rPr>
-        <w:t xml:space="preserve">4.3 Live Slides Sync &amp; Customizer
-</w:t>
-      </w:r>
-      <w:r>
-        <w:rPr>
-          <w:sz w:val="24"/>
-          <w:szCs w:val="24"/>
-        </w:rPr>
-        <w:t xml:space="preserve">During the LOBBY phase, hosts customize titles, bullet outlines, and poll choice selections. Saving deletes old slides and inserts the new list transactional array using nested relational mappings. Sync clients poll at 1.5s intervals to update views.</w:t>
+        <w:t xml:space="preserve">9.3 Security Specifications
+</w:t>
+      </w:r>
+      <w:r>
+        <w:rPr>
+          <w:sz w:val="24"/>
+          <w:szCs w:val="24"/>
+        </w:rPr>
+        <w:t xml:space="preserve">• Auth.js validates credentials securely using encrypted cookies.
+• Host checking restricts local Ollama configurations only to 'localhost' connections, avoiding security exposures on public URLs.
+</w:t>
+      </w:r>
+    </w:p>
+    <w:p>
+      <w:pPr>
+        <w:pStyle w:val="Heading1"/>
+        <w:spacing w:after="200" w:before="600"/>
+      </w:pPr>
+      <w:r>
+        <w:t xml:space="preserve">10. Performance, Scale &amp; Logging</w:t>
+      </w:r>
+    </w:p>
+    <w:p>
+      <w:pPr>
+        <w:spacing w:after="150"/>
+      </w:pPr>
+      <w:r>
+        <w:rPr>
+          <w:b/>
+          <w:bCs/>
+          <w:sz w:val="24"/>
+          <w:szCs w:val="24"/>
+        </w:rPr>
+        <w:t xml:space="preserve">10.1 Performance &amp; Scalability
+</w:t>
+      </w:r>
+      <w:r>
+        <w:rPr>
+          <w:sz w:val="24"/>
+          <w:szCs w:val="24"/>
+        </w:rPr>
+        <w:t xml:space="preserve">To support large concurrent sessions, Prisma database connections are pooled, and static page caching is applied to dashboard and document outline screens. The 1.5s student sync poll queries a lightweight session state view, reducing write contention.</w:t>
+      </w:r>
+    </w:p>
+    <w:p>
+      <w:pPr>
+        <w:spacing w:after="200"/>
+      </w:pPr>
+      <w:r>
+        <w:rPr>
+          <w:b/>
+          <w:bCs/>
+          <w:sz w:val="24"/>
+          <w:szCs w:val="24"/>
+        </w:rPr>
+        <w:t xml:space="preserve">10.2 Monitoring &amp; Logging
+</w:t>
+      </w:r>
+      <w:r>
+        <w:rPr>
+          <w:sz w:val="24"/>
+          <w:szCs w:val="24"/>
+        </w:rPr>
+        <w:t xml:space="preserve">Backend service processes log structured JSON messages describing request targets, LLM latency metrics, and database transactional execution times for easy monitoring.</w:t>
       </w:r>
     </w:p>
     <w:p>
@@ -526,7 +899,29 @@
         <w:spacing w:after="200" w:before="600"/>
       </w:pPr>
       <w:r>
-        <w:t xml:space="preserve">5. Operational Guide &amp; Diagnostics</w:t>
+        <w:t xml:space="preserve">11. Testing Strategy &amp; Design Decisions</w:t>
+      </w:r>
+    </w:p>
+    <w:p>
+      <w:pPr>
+        <w:spacing w:after="150"/>
+      </w:pPr>
+      <w:r>
+        <w:rPr>
+          <w:b/>
+          <w:bCs/>
+          <w:sz w:val="24"/>
+          <w:szCs w:val="24"/>
+        </w:rPr>
+        <w:t xml:space="preserve">11.1 Testing Strategy
+</w:t>
+      </w:r>
+      <w:r>
+        <w:rPr>
+          <w:sz w:val="24"/>
+          <w:szCs w:val="24"/>
+        </w:rPr>
+        <w:t xml:space="preserve">The strategy combines unit tests for AI parsers, integration tests for server action database inserts, and local E2E simulation of student joining flows.</w:t>
       </w:r>
     </w:p>
     <w:p>
@@ -535,10 +930,31 @@
       </w:pPr>
       <w:r>
         <w:rPr>
-          <w:sz w:val="24"/>
-          <w:szCs w:val="24"/>
-        </w:rPr>
-        <w:t xml:space="preserve">StudyTest AI target deployment is optimized for serverless hosting on Vercel. For local offline development and testing of local Ollama server models:</w:t>
+          <w:b/>
+          <w:bCs/>
+          <w:sz w:val="24"/>
+          <w:szCs w:val="24"/>
+        </w:rPr>
+        <w:t xml:space="preserve">11.2 Trade-offs &amp; Design Decisions
+</w:t>
+      </w:r>
+      <w:r>
+        <w:rPr>
+          <w:sz w:val="24"/>
+          <w:szCs w:val="24"/>
+        </w:rPr>
+        <w:t xml:space="preserve">• Polling vs. WebSockets: Polling was selected over WebSockets to allow standard serverless action scales on Vercel without configuring separate sticky session servers.
+• Cookie Key Storage: Keeps keys local to browser, ensuring zero compliance overhead for backend database storage.
+</w:t>
+      </w:r>
+    </w:p>
+    <w:p>
+      <w:pPr>
+        <w:pStyle w:val="Heading1"/>
+        <w:spacing w:after="200" w:before="600"/>
+      </w:pPr>
+      <w:r>
+        <w:t xml:space="preserve">12. Future Enhancements &amp; Appendix</w:t>
       </w:r>
     </w:p>
     <w:p>
@@ -552,35 +968,17 @@
           <w:sz w:val="24"/>
           <w:szCs w:val="24"/>
         </w:rPr>
-        <w:t xml:space="preserve">1. Serve Ollama: </w:t>
-      </w:r>
-      <w:r>
-        <w:rPr>
-          <w:sz w:val="24"/>
-          <w:szCs w:val="24"/>
-        </w:rPr>
-        <w:t xml:space="preserve">Run 'OLLAMA_HOST=0.0.0.0 ollama serve' locally to bind network interfaces.</w:t>
-      </w:r>
-    </w:p>
-    <w:p>
-      <w:pPr>
-        <w:spacing w:after="150"/>
-      </w:pPr>
-      <w:r>
-        <w:rPr>
-          <w:b/>
-          <w:bCs/>
-          <w:sz w:val="24"/>
-          <w:szCs w:val="24"/>
-        </w:rPr>
-        <w:t xml:space="preserve">2. Tunnels Routing: </w:t>
-      </w:r>
-      <w:r>
-        <w:rPr>
-          <w:sz w:val="24"/>
-          <w:szCs w:val="24"/>
-        </w:rPr>
-        <w:t xml:space="preserve">Execute tunneling services (localtunnel or ngrok on port 11434) to expose endpoints to the Vercel cloud environment.</w:t>
+        <w:t xml:space="preserve">12.1 Future Enhancements
+</w:t>
+      </w:r>
+      <w:r>
+        <w:rPr>
+          <w:sz w:val="24"/>
+          <w:szCs w:val="24"/>
+        </w:rPr>
+        <w:t xml:space="preserve">• WebRTC sync channels for instantaneous presentations updates.
+• Advanced AI document processing models with audio-out narration support.
+</w:t>
       </w:r>
     </w:p>
     <w:p>
@@ -594,14 +992,15 @@
           <w:sz w:val="24"/>
           <w:szCs w:val="24"/>
         </w:rPr>
-        <w:t xml:space="preserve">3. Host Validation: </w:t>
-      </w:r>
-      <w:r>
-        <w:rPr>
-          <w:sz w:val="24"/>
-          <w:szCs w:val="24"/>
-        </w:rPr>
-        <w:t xml:space="preserve">The settings panel dynamically checks 'window.location.hostname' to render the Local Ollama server choice only on 'localhost' and hide it in public cloud deployments.</w:t>
+        <w:t xml:space="preserve">12.2 Appendix
+</w:t>
+      </w:r>
+      <w:r>
+        <w:rPr>
+          <w:sz w:val="24"/>
+          <w:szCs w:val="24"/>
+        </w:rPr>
+        <w:t xml:space="preserve">Contains instructions for running local Ollama servers: bind network interfaces via 'OLLAMA_HOST=0.0.0.0 ollama serve' and expose it via localtunnel tunnels.</w:t>
       </w:r>
     </w:p>
     <w:sectPr>

</xml_diff>

<commit_message>
fix(build): correct docx spacing/indent types and exclude scripts from next build
</commit_message>
<xml_diff>
--- a/Technical_Design_Document.docx
+++ b/Technical_Design_Document.docx
@@ -137,7 +137,7 @@
           <w:sz w:val="24"/>
           <w:szCs w:val="24"/>
         </w:rPr>
-        <w:t xml:space="preserve">September 7, 2026
+        <w:t xml:space="preserve">September 11, 2026
 </w:t>
       </w:r>
     </w:p>
@@ -462,6 +462,7 @@
     <w:p>
       <w:pPr>
         <w:spacing w:after="150"/>
+        <w:ind w:left="720"/>
       </w:pPr>
       <w:r>
         <w:rPr>
@@ -483,6 +484,7 @@
     <w:p>
       <w:pPr>
         <w:spacing w:after="150"/>
+        <w:ind w:left="720"/>
       </w:pPr>
       <w:r>
         <w:rPr>
@@ -525,6 +527,7 @@
     <w:p>
       <w:pPr>
         <w:spacing w:after="150"/>
+        <w:ind w:left="720"/>
       </w:pPr>
       <w:r>
         <w:rPr>
@@ -546,6 +549,7 @@
     <w:p>
       <w:pPr>
         <w:spacing w:after="150"/>
+        <w:ind w:left="720"/>
       </w:pPr>
       <w:r>
         <w:rPr>
@@ -567,6 +571,7 @@
     <w:p>
       <w:pPr>
         <w:spacing w:after="150"/>
+        <w:ind w:left="720"/>
       </w:pPr>
       <w:r>
         <w:rPr>
@@ -588,6 +593,7 @@
     <w:p>
       <w:pPr>
         <w:spacing w:after="150"/>
+        <w:ind w:left="720"/>
       </w:pPr>
       <w:r>
         <w:rPr>
@@ -609,6 +615,7 @@
     <w:p>
       <w:pPr>
         <w:spacing w:after="200"/>
+        <w:ind w:left="720"/>
       </w:pPr>
       <w:r>
         <w:rPr>
@@ -660,6 +667,7 @@
     <w:p>
       <w:pPr>
         <w:spacing w:after="150"/>
+        <w:ind w:left="720"/>
       </w:pPr>
       <w:r>
         <w:rPr>
@@ -681,6 +689,7 @@
     <w:p>
       <w:pPr>
         <w:spacing w:after="150"/>
+        <w:ind w:left="720"/>
       </w:pPr>
       <w:r>
         <w:rPr>
@@ -702,6 +711,7 @@
     <w:p>
       <w:pPr>
         <w:spacing w:after="150"/>
+        <w:ind w:left="720"/>
       </w:pPr>
       <w:r>
         <w:rPr>
@@ -723,6 +733,7 @@
     <w:p>
       <w:pPr>
         <w:spacing w:after="200"/>
+        <w:ind w:left="720"/>
       </w:pPr>
       <w:r>
         <w:rPr>
@@ -1376,6 +1387,7 @@
     <w:p>
       <w:pPr>
         <w:spacing w:after="150"/>
+        <w:ind w:left="720"/>
       </w:pPr>
       <w:r>
         <w:rPr>
@@ -1397,6 +1409,7 @@
     <w:p>
       <w:pPr>
         <w:spacing w:after="150"/>
+        <w:ind w:left="720"/>
       </w:pPr>
       <w:r>
         <w:rPr>
@@ -1418,6 +1431,7 @@
     <w:p>
       <w:pPr>
         <w:spacing w:after="150"/>
+        <w:ind w:left="720"/>
       </w:pPr>
       <w:r>
         <w:rPr>
@@ -1439,6 +1453,7 @@
     <w:p>
       <w:pPr>
         <w:spacing w:after="200"/>
+        <w:ind w:left="720"/>
       </w:pPr>
       <w:r>
         <w:rPr>

</xml_diff>